<commit_message>
docs: update the rapport_I431.docx
</commit_message>
<xml_diff>
--- a/docs/rapport_I431.docx
+++ b/docs/rapport_I431.docx
@@ -628,137 +628,6 @@
       <w:pPr>
         <w:ind w:left="720"/>
       </w:pPr>
-      <w:r>
-        <w:rPr>
-          <w:noProof/>
-        </w:rPr>
-        <w:lastRenderedPageBreak/>
-        <mc:AlternateContent>
-          <mc:Choice Requires="wps">
-            <w:drawing>
-              <wp:anchor distT="0" distB="0" distL="114300" distR="114300" simplePos="0" relativeHeight="251659264" behindDoc="0" locked="0" layoutInCell="1" allowOverlap="1" wp14:anchorId="0DD56A4A" wp14:editId="747BFEFC">
-                <wp:simplePos x="0" y="0"/>
-                <wp:positionH relativeFrom="column">
-                  <wp:posOffset>500380</wp:posOffset>
-                </wp:positionH>
-                <wp:positionV relativeFrom="paragraph">
-                  <wp:posOffset>-642620</wp:posOffset>
-                </wp:positionV>
-                <wp:extent cx="5629275" cy="638175"/>
-                <wp:effectExtent l="0" t="0" r="9525" b="9525"/>
-                <wp:wrapNone/>
-                <wp:docPr id="428109913" name="Zone de texte 7"/>
-                <wp:cNvGraphicFramePr/>
-                <a:graphic xmlns:a="http://schemas.openxmlformats.org/drawingml/2006/main">
-                  <a:graphicData uri="http://schemas.microsoft.com/office/word/2010/wordprocessingShape">
-                    <wps:wsp>
-                      <wps:cNvSpPr txBox="1"/>
-                      <wps:spPr>
-                        <a:xfrm>
-                          <a:off x="0" y="0"/>
-                          <a:ext cx="5629275" cy="638175"/>
-                        </a:xfrm>
-                        <a:prstGeom prst="rect">
-                          <a:avLst/>
-                        </a:prstGeom>
-                        <a:solidFill>
-                          <a:schemeClr val="lt1"/>
-                        </a:solidFill>
-                        <a:ln w="6350">
-                          <a:noFill/>
-                        </a:ln>
-                      </wps:spPr>
-                      <wps:txbx>
-                        <w:txbxContent>
-                          <w:p>
-                            <w:pPr>
-                              <w:pStyle w:val="Titre1"/>
-                            </w:pPr>
-                            <w:r>
-                              <w:t>Page de login :</w:t>
-                            </w:r>
-                          </w:p>
-                        </w:txbxContent>
-                      </wps:txbx>
-                      <wps:bodyPr rot="0" spcFirstLastPara="0" vertOverflow="overflow" horzOverflow="overflow" vert="horz" wrap="square" lIns="91440" tIns="45720" rIns="91440" bIns="45720" numCol="1" spcCol="0" rtlCol="0" fromWordArt="0" anchor="t" anchorCtr="0" forceAA="0" compatLnSpc="1">
-                        <a:prstTxWarp prst="textNoShape">
-                          <a:avLst/>
-                        </a:prstTxWarp>
-                        <a:noAutofit/>
-                      </wps:bodyPr>
-                    </wps:wsp>
-                  </a:graphicData>
-                </a:graphic>
-                <wp14:sizeRelV relativeFrom="margin">
-                  <wp14:pctHeight>0</wp14:pctHeight>
-                </wp14:sizeRelV>
-              </wp:anchor>
-            </w:drawing>
-          </mc:Choice>
-          <mc:Fallback>
-            <w:pict>
-              <v:shapetype w14:anchorId="0DD56A4A" id="_x0000_t202" coordsize="21600,21600" o:spt="202" path="m,l,21600r21600,l21600,xe">
-                <v:stroke joinstyle="miter"/>
-                <v:path gradientshapeok="t" o:connecttype="rect"/>
-              </v:shapetype>
-              <v:shape id="Zone de texte 7" o:spid="_x0000_s1026" type="#_x0000_t202" style="position:absolute;left:0;text-align:left;margin-left:39.4pt;margin-top:-50.6pt;width:443.25pt;height:50.25pt;z-index:251659264;visibility:visible;mso-wrap-style:square;mso-height-percent:0;mso-wrap-distance-left:9pt;mso-wrap-distance-top:0;mso-wrap-distance-right:9pt;mso-wrap-distance-bottom:0;mso-position-horizontal:absolute;mso-position-horizontal-relative:text;mso-position-vertical:absolute;mso-position-vertical-relative:text;mso-height-percent:0;mso-height-relative:margin;v-text-anchor:top" o:gfxdata="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" fillcolor="white [3201]" stroked="f" strokeweight=".5pt">
-                <v:textbox>
-                  <w:txbxContent>
-                    <w:p>
-                      <w:pPr>
-                        <w:pStyle w:val="Titre1"/>
-                      </w:pPr>
-                      <w:r>
-                        <w:t>Page de login :</w:t>
-                      </w:r>
-                    </w:p>
-                  </w:txbxContent>
-                </v:textbox>
-              </v:shape>
-            </w:pict>
-          </mc:Fallback>
-        </mc:AlternateContent>
-      </w:r>
-      <w:r>
-        <w:rPr>
-          <w:noProof/>
-        </w:rPr>
-        <w:drawing>
-          <wp:inline distT="0" distB="0" distL="0" distR="0" wp14:anchorId="54237ED5" wp14:editId="7B35DEEF">
-            <wp:extent cx="5760720" cy="4091940"/>
-            <wp:effectExtent l="0" t="0" r="0" b="3810"/>
-            <wp:docPr id="1735098627" name="Image 1"/>
-            <wp:cNvGraphicFramePr>
-              <a:graphicFrameLocks xmlns:a="http://schemas.openxmlformats.org/drawingml/2006/main" noChangeAspect="1"/>
-            </wp:cNvGraphicFramePr>
-            <a:graphic xmlns:a="http://schemas.openxmlformats.org/drawingml/2006/main">
-              <a:graphicData uri="http://schemas.openxmlformats.org/drawingml/2006/picture">
-                <pic:pic xmlns:pic="http://schemas.openxmlformats.org/drawingml/2006/picture">
-                  <pic:nvPicPr>
-                    <pic:cNvPr id="1735098627" name=""/>
-                    <pic:cNvPicPr/>
-                  </pic:nvPicPr>
-                  <pic:blipFill>
-                    <a:blip r:embed="rId6"/>
-                    <a:stretch>
-                      <a:fillRect/>
-                    </a:stretch>
-                  </pic:blipFill>
-                  <pic:spPr>
-                    <a:xfrm>
-                      <a:off x="0" y="0"/>
-                      <a:ext cx="5760720" cy="4091940"/>
-                    </a:xfrm>
-                    <a:prstGeom prst="rect">
-                      <a:avLst/>
-                    </a:prstGeom>
-                  </pic:spPr>
-                </pic:pic>
-              </a:graphicData>
-            </a:graphic>
-          </wp:inline>
-        </w:drawing>
-      </w:r>
     </w:p>
     <w:p>
       <w:pPr>
@@ -771,7 +640,7 @@
         <mc:AlternateContent>
           <mc:Choice Requires="wps">
             <w:drawing>
-              <wp:anchor distT="0" distB="0" distL="114300" distR="114300" simplePos="0" relativeHeight="251661312" behindDoc="0" locked="0" layoutInCell="1" allowOverlap="1" wp14:anchorId="6A92248A" wp14:editId="114871A7">
+              <wp:anchor distT="0" distB="0" distL="114300" distR="114300" simplePos="0" relativeHeight="251661312" behindDoc="0" locked="0" layoutInCell="1" allowOverlap="1" wp14:anchorId="6A92248A" wp14:editId="18A4BF1A">
                 <wp:simplePos x="0" y="0"/>
                 <wp:positionH relativeFrom="column">
                   <wp:posOffset>538480</wp:posOffset>
@@ -840,7 +709,11 @@
           </mc:Choice>
           <mc:Fallback>
             <w:pict>
-              <v:shape w14:anchorId="6A92248A" id="_x0000_s1027" type="#_x0000_t202" style="position:absolute;left:0;text-align:left;margin-left:42.4pt;margin-top:2.85pt;width:443.25pt;height:57.75pt;z-index:251661312;visibility:visible;mso-wrap-style:square;mso-height-percent:0;mso-wrap-distance-left:9pt;mso-wrap-distance-top:0;mso-wrap-distance-right:9pt;mso-wrap-distance-bottom:0;mso-position-horizontal:absolute;mso-position-horizontal-relative:text;mso-position-vertical:absolute;mso-position-vertical-relative:text;mso-height-percent:0;mso-height-relative:margin;v-text-anchor:top" o:gfxdata="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" fillcolor="white [3201]" stroked="f" strokeweight=".5pt">
+              <v:shapetype w14:anchorId="6A92248A" id="_x0000_t202" coordsize="21600,21600" o:spt="202" path="m,l,21600r21600,l21600,xe">
+                <v:stroke joinstyle="miter"/>
+                <v:path gradientshapeok="t" o:connecttype="rect"/>
+              </v:shapetype>
+              <v:shape id="Zone de texte 7" o:spid="_x0000_s1026" type="#_x0000_t202" style="position:absolute;left:0;text-align:left;margin-left:42.4pt;margin-top:2.85pt;width:443.25pt;height:57.75pt;z-index:251661312;visibility:visible;mso-wrap-style:square;mso-height-percent:0;mso-wrap-distance-left:9pt;mso-wrap-distance-top:0;mso-wrap-distance-right:9pt;mso-wrap-distance-bottom:0;mso-position-horizontal:absolute;mso-position-horizontal-relative:text;mso-position-vertical:absolute;mso-position-vertical-relative:text;mso-height-percent:0;mso-height-relative:margin;v-text-anchor:top" o:gfxdata="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" fillcolor="white [3201]" stroked="f" strokeweight=".5pt">
                 <v:textbox>
                   <w:txbxContent>
                     <w:p>
@@ -894,9 +767,17 @@
           <w:lang w:eastAsia="fr-CH"/>
         </w:rPr>
         <w:drawing>
-          <wp:inline distT="0" distB="0" distL="0" distR="0" wp14:anchorId="2C5CEDE5" wp14:editId="67982936">
+          <wp:anchor distT="0" distB="0" distL="114300" distR="114300" simplePos="0" relativeHeight="251664384" behindDoc="0" locked="0" layoutInCell="1" allowOverlap="1" wp14:anchorId="1A87AC31" wp14:editId="1BCD7572">
+            <wp:simplePos x="0" y="0"/>
+            <wp:positionH relativeFrom="column">
+              <wp:posOffset>214630</wp:posOffset>
+            </wp:positionH>
+            <wp:positionV relativeFrom="paragraph">
+              <wp:posOffset>5715</wp:posOffset>
+            </wp:positionV>
             <wp:extent cx="5760720" cy="2716530"/>
             <wp:effectExtent l="0" t="0" r="0" b="7620"/>
+            <wp:wrapNone/>
             <wp:docPr id="577482563" name="Image 5"/>
             <wp:cNvGraphicFramePr>
               <a:graphicFrameLocks xmlns:a="http://schemas.openxmlformats.org/drawingml/2006/main" noChangeAspect="1"/>
@@ -911,7 +792,7 @@
                     </pic:cNvPicPr>
                   </pic:nvPicPr>
                   <pic:blipFill>
-                    <a:blip r:embed="rId7" cstate="print">
+                    <a:blip r:embed="rId6" cstate="print">
                       <a:extLst>
                         <a:ext uri="{28A0092B-C50C-407E-A947-70E740481C1C}">
                           <a14:useLocalDpi xmlns:a14="http://schemas.microsoft.com/office/drawing/2010/main" val="0"/>
@@ -939,7 +820,7 @@
                 </pic:pic>
               </a:graphicData>
             </a:graphic>
-          </wp:inline>
+          </wp:anchor>
         </w:drawing>
       </w:r>
     </w:p>
@@ -1090,7 +971,7 @@
                     </pic:cNvPicPr>
                   </pic:nvPicPr>
                   <pic:blipFill>
-                    <a:blip r:embed="rId8" cstate="print">
+                    <a:blip r:embed="rId7" cstate="print">
                       <a:extLst>
                         <a:ext uri="{28A0092B-C50C-407E-A947-70E740481C1C}">
                           <a14:useLocalDpi xmlns:a14="http://schemas.microsoft.com/office/drawing/2010/main" val="0"/>
@@ -1859,7 +1740,15 @@
       </w:r>
       <w:proofErr w:type="spellEnd"/>
       <w:r>
-        <w:t xml:space="preserve"> à été très utile et importante dans notre projet car il y a des choses qu’on ne connaissait pas </w:t>
+        <w:t xml:space="preserve"> </w:t>
+      </w:r>
+      <w:proofErr w:type="spellStart"/>
+      <w:r>
+        <w:t>à</w:t>
+      </w:r>
+      <w:proofErr w:type="spellEnd"/>
+      <w:r>
+        <w:t xml:space="preserve"> été très utile et importante dans notre projet car il y a des choses qu’on ne connaissait pas </w:t>
       </w:r>
       <w:r>
         <w:t xml:space="preserve">et on n’avait pas le temps de tout apprendre en quelque semaine, </w:t>
@@ -8172,6 +8061,7 @@
   <w:style w:type="character" w:default="1" w:styleId="Policepardfaut">
     <w:name w:val="Default Paragraph Font"/>
     <w:uiPriority w:val="1"/>
+    <w:semiHidden/>
     <w:unhideWhenUsed/>
   </w:style>
   <w:style w:type="table" w:default="1" w:styleId="TableauNormal">

</xml_diff>